<commit_message>
Finalize platform-only VRS AI handoff package
</commit_message>
<xml_diff>
--- a/output/doc/VRS-Express-VRS-AI-Bridge-Integration-Handoff.docx
+++ b/output/doc/VRS-Express-VRS-AI-Bridge-Integration-Handoff.docx
@@ -229,20 +229,8 @@
             <w:shd w:fill="F3F5F7"/>
           </w:tcPr>
           <w:p>
-            <w:pPr>
-              <w:spacing w:after="0"/>
-            </w:pPr>
-            <w:r>
-              <w:rPr>
-                <w:rFonts w:ascii="Aptos" w:hAnsi="Aptos"/>
-              </w:rPr>
-            </w:r>
-            <w:r>
-              <w:rPr>
-                <w:rFonts w:ascii="Aptos" w:hAnsi="Aptos"/>
-                <w:sz w:val="16"/>
-              </w:rPr>
-              <w:t>Staging integration handoff</w:t>
+            <w:r>
+              <w:t>Implementation handoff - staging activation pending</w:t>
             </w:r>
           </w:p>
         </w:tc>
@@ -292,20 +280,8 @@
             </w:tcMar>
           </w:tcPr>
           <w:p>
-            <w:pPr>
-              <w:spacing w:after="0"/>
-            </w:pPr>
-            <w:r>
-              <w:rPr>
-                <w:rFonts w:ascii="Aptos" w:hAnsi="Aptos"/>
-              </w:rPr>
-            </w:r>
-            <w:r>
-              <w:rPr>
-                <w:rFonts w:ascii="Aptos" w:hAnsi="Aptos"/>
-                <w:sz w:val="16"/>
-              </w:rPr>
-              <w:t>2026-07-28</w:t>
+            <w:r>
+              <w:t>2026-07-29</w:t>
             </w:r>
           </w:p>
         </w:tc>
@@ -357,20 +333,8 @@
             <w:shd w:fill="F3F5F7"/>
           </w:tcPr>
           <w:p>
-            <w:pPr>
-              <w:spacing w:after="0"/>
-            </w:pPr>
-            <w:r>
-              <w:rPr>
-                <w:rFonts w:ascii="Aptos" w:hAnsi="Aptos"/>
-              </w:rPr>
-            </w:r>
-            <w:r>
-              <w:rPr>
-                <w:rFonts w:ascii="Aptos" w:hAnsi="Aptos"/>
-                <w:sz w:val="16"/>
-              </w:rPr>
-              <w:t>SASHA API Contract V5 plus the July 24 Granola ownership decision</w:t>
+            <w:r>
+              <w:t>API Contract V5 and the approved VRS Express / VRS AI ownership model</w:t>
             </w:r>
           </w:p>
         </w:tc>
@@ -391,20 +355,8 @@
             </w:tcMar>
           </w:tcPr>
           <w:p>
-            <w:pPr>
-              <w:spacing w:after="0"/>
-            </w:pPr>
-            <w:r>
-              <w:rPr>
-                <w:rFonts w:ascii="Aptos" w:hAnsi="Aptos"/>
-              </w:rPr>
-            </w:r>
-            <w:r>
-              <w:rPr>
-                <w:rFonts w:ascii="Aptos" w:hAnsi="Aptos"/>
-                <w:sz w:val="16"/>
-              </w:rPr>
-              <w:t>Express implementation</w:t>
+            <w:r>
+              <w:t>VRS Express status</w:t>
             </w:r>
           </w:p>
         </w:tc>
@@ -420,45 +372,9 @@
             </w:tcMar>
           </w:tcPr>
           <w:p>
-            <w:pPr>
-              <w:spacing w:after="0"/>
-            </w:pPr>
-            <w:r>
-              <w:rPr>
-                <w:rFonts w:ascii="Aptos" w:hAnsi="Aptos"/>
-              </w:rPr>
-            </w:r>
-            <w:r>
-              <w:rPr>
-                <w:rFonts w:ascii="Aptos" w:hAnsi="Aptos"/>
-                <w:sz w:val="16"/>
-              </w:rPr>
-              <w:t xml:space="preserve">Commit </w:t>
-            </w:r>
-            <w:r>
-              <w:rPr>
-                <w:rFonts w:ascii="Aptos" w:hAnsi="Aptos"/>
-                <w:color w:val="17365D"/>
-                <w:sz w:val="16"/>
-              </w:rPr>
-              <w:t>6ec180f</w:t>
-            </w:r>
-            <w:r>
-              <w:rPr>
-                <w:rFonts w:ascii="Aptos" w:hAnsi="Aptos"/>
-                <w:sz w:val="16"/>
-              </w:rPr>
-              <w:t xml:space="preserve"> on draft </w:t>
-            </w:r>
-            <w:hyperlink r:id="rId11">
-              <w:r>
-                <w:rPr>
-                  <w:color w:val="1F4E78"/>
-                  <w:u w:val="single"/>
-                </w:rPr>
-                <w:t>PR #1</w:t>
-              </w:r>
-            </w:hyperlink>
+            <w:r>
+              <w:t>Source merged and published; bridge activation pending configuration and acceptance</w:t>
+            </w:r>
           </w:p>
         </w:tc>
       </w:tr>
@@ -517,15 +433,13 @@
                 <w:rFonts w:ascii="Aptos" w:hAnsi="Aptos"/>
               </w:rPr>
             </w:r>
-            <w:hyperlink r:id="rId12">
-              <w:r>
-                <w:rPr>
-                  <w:color w:val="1F4E78"/>
-                  <w:u w:val="single"/>
-                </w:rPr>
-                <w:t>vrs-express-vrs-ai-bridge-openapi.yaml</w:t>
-              </w:r>
-            </w:hyperlink>
+            <w:r>
+              <w:rPr>
+                <w:color w:val="1F4E78"/>
+                <w:u w:val="single"/>
+              </w:rPr>
+              <w:t>vrs-express-vrs-ai-bridge-openapi.yaml</w:t>
+            </w:r>
           </w:p>
         </w:tc>
       </w:tr>
@@ -537,7 +451,7 @@
     </w:p>
     <w:p>
       <w:r>
-        <w:t>No production deployment or production database change has been made. This document describes the interface implemented in the draft VRS Express branch and the corresponding interface VRS AI must provide.</w:t>
+        <w:t>This document defines the implementation interface between VRS Express and VRS AI. VRS Express source is merged and published. The bridge remains disabled for live traffic until staging configuration, the additive development schema, and joint acceptance checks are complete. No live keys or secrets are included in this package.</w:t>
       </w:r>
     </w:p>
     <w:p>
@@ -683,7 +597,7 @@
     </w:p>
     <w:p>
       <w:r>
-        <w:t>VRS Express already implements the human approval gate, outbound request, callback verification, ticket/SMS application, event idempotency, and final callback forwarding to SASHA.</w:t>
+        <w:t>VRS Express already implements the human approval gate, outbound request, callback verification, ticket/SMS application, event idempotency, and final callback forwarding to the upstream workflow.</w:t>
       </w:r>
     </w:p>
     <w:p>
@@ -706,9 +620,9 @@
           <w:color w:val="1F2937"/>
           <w:sz w:val="16"/>
         </w:rPr>
-        <w:t>SASHA / Tech Hub</w:t>
+        <w:t>VRS Express</w:t>
         <w:br/>
-        <w:t xml:space="preserve">  -&gt; VRS Express intake</w:t>
+        <w:t xml:space="preserve">  -&gt; receives and validates the authorization request</w:t>
         <w:br/>
         <w:t xml:space="preserve">  -&gt; normal pending Express ticket</w:t>
         <w:br/>
@@ -724,7 +638,7 @@
         <w:br/>
         <w:t xml:space="preserve">  -&gt; Express applies the normal ticket outcome and technician SMS</w:t>
         <w:br/>
-        <w:t xml:space="preserve">  -&gt; Express signs and forwards the result to SASHA</w:t>
+        <w:t xml:space="preserve">  -&gt; Express signs and forwards the result to the upstream workflow</w:t>
       </w:r>
     </w:p>
     <w:p>
@@ -864,69 +778,6 @@
               <w:bottom w:w="80" w:type="dxa"/>
               <w:end w:w="100" w:type="dxa"/>
             </w:tcMar>
-          </w:tcPr>
-          <w:p>
-            <w:pPr>
-              <w:spacing w:after="0"/>
-            </w:pPr>
-            <w:r>
-              <w:rPr>
-                <w:rFonts w:ascii="Aptos" w:hAnsi="Aptos"/>
-              </w:rPr>
-            </w:r>
-            <w:r>
-              <w:rPr>
-                <w:rFonts w:ascii="Aptos" w:hAnsi="Aptos"/>
-                <w:sz w:val="16"/>
-              </w:rPr>
-              <w:t>SASHA / Tech Hub</w:t>
-            </w:r>
-          </w:p>
-        </w:tc>
-        <w:tc>
-          <w:tcPr>
-            <w:tcW w:type="dxa" w:w="5083"/>
-            <w:vAlign w:val="center"/>
-            <w:tcMar>
-              <w:top w:w="80" w:type="dxa"/>
-              <w:start w:w="100" w:type="dxa"/>
-              <w:bottom w:w="80" w:type="dxa"/>
-              <w:end w:w="100" w:type="dxa"/>
-            </w:tcMar>
-          </w:tcPr>
-          <w:p>
-            <w:pPr>
-              <w:spacing w:after="0"/>
-            </w:pPr>
-            <w:r>
-              <w:rPr>
-                <w:rFonts w:ascii="Aptos" w:hAnsi="Aptos"/>
-              </w:rPr>
-            </w:r>
-            <w:r>
-              <w:rPr>
-                <w:rFonts w:ascii="Aptos" w:hAnsi="Aptos"/>
-                <w:sz w:val="16"/>
-              </w:rPr>
-              <w:t>Initial V5 data capture, initial Express intake, final result UX</w:t>
-            </w:r>
-          </w:p>
-        </w:tc>
-      </w:tr>
-      <w:tr>
-        <w:trPr>
-          <w:cantSplit/>
-        </w:trPr>
-        <w:tc>
-          <w:tcPr>
-            <w:tcW w:type="dxa" w:w="5083"/>
-            <w:vAlign w:val="center"/>
-            <w:tcMar>
-              <w:top w:w="80" w:type="dxa"/>
-              <w:start w:w="100" w:type="dxa"/>
-              <w:bottom w:w="80" w:type="dxa"/>
-              <w:end w:w="100" w:type="dxa"/>
-            </w:tcMar>
             <w:shd w:fill="F3F5F7"/>
           </w:tcPr>
           <w:p>
@@ -960,20 +811,8 @@
             <w:shd w:fill="F3F5F7"/>
           </w:tcPr>
           <w:p>
-            <w:pPr>
-              <w:spacing w:after="0"/>
-            </w:pPr>
-            <w:r>
-              <w:rPr>
-                <w:rFonts w:ascii="Aptos" w:hAnsi="Aptos"/>
-              </w:rPr>
-            </w:r>
-            <w:r>
-              <w:rPr>
-                <w:rFonts w:ascii="Aptos" w:hAnsi="Aptos"/>
-                <w:sz w:val="16"/>
-              </w:rPr>
-              <w:t>Human review, outbound AI dispatch, result verification, ticket/SMS processing, SASHA forwarding</w:t>
+            <w:r>
+              <w:t>Authorization intake, human review, outbound AI dispatch, result verification, ticket/SMS processing, and upstream forwarding</w:t>
             </w:r>
           </w:p>
         </w:tc>
@@ -1456,7 +1295,7 @@
         <w:br/>
         <w:t xml:space="preserve">  "tech_phone": "+12145550199",</w:t>
         <w:br/>
-        <w:t xml:space="preserve">  "tech_name": "Carlos Rivera",</w:t>
+        <w:t xml:space="preserve">  "tech_name": "Example Technician",</w:t>
         <w:br/>
         <w:t xml:space="preserve">  "reason_for_call": "authorization",</w:t>
         <w:br/>
@@ -1480,7 +1319,7 @@
         <w:br/>
         <w:t xml:space="preserve">  ],</w:t>
         <w:br/>
-        <w:t xml:space="preserve">  "customer_name": "Maria Gonzalez",</w:t>
+        <w:t xml:space="preserve">  "customer_name": "Example Customer",</w:t>
         <w:br/>
         <w:t xml:space="preserve">  "customer_address": "742 Evergreen Terrace, Hagerstown, MD 21740",</w:t>
         <w:br/>
@@ -1541,7 +1380,7 @@
     </w:p>
     <w:p>
       <w:r>
-        <w:t xml:space="preserve">Express passes the approved V5 business payload through unchanged, except that it replaces SASHA's original </w:t>
+        <w:t>Express passes the approved V5 business payload through unchanged, except that it replaces the upstream callback_url and callback_secret with the Express callback endpoint and Express callback secret.</w:t>
       </w:r>
       <w:r>
         <w:rPr>
@@ -1549,22 +1388,16 @@
           <w:color w:val="17365D"/>
           <w:sz w:val="18"/>
         </w:rPr>
-        <w:t>callback_url</w:t>
-      </w:r>
-      <w:r>
-        <w:t xml:space="preserve"> and </w:t>
-      </w:r>
+      </w:r>
+      <w:r/>
       <w:r>
         <w:rPr>
           <w:rFonts w:ascii="Consolas" w:hAnsi="Consolas"/>
           <w:color w:val="17365D"/>
           <w:sz w:val="18"/>
         </w:rPr>
-        <w:t>callback_secret</w:t>
-      </w:r>
-      <w:r>
-        <w:t xml:space="preserve"> with the Express callback endpoint and Express callback secret.</w:t>
-      </w:r>
+      </w:r>
+      <w:r/>
     </w:p>
     <w:p>
       <w:pPr>
@@ -4676,22 +4509,17 @@
           <w:color w:val="17365D"/>
           <w:sz w:val="18"/>
         </w:rPr>
-        <w:t>call_id</w:t>
-      </w:r>
-      <w:r>
-        <w:t xml:space="preserve"> is VRS AI's provider call identifier. It must be globally unique and stable. Express stores it separately from the public Express/SASHA bridge ID. Every callback from VRS AI must use this value in </w:t>
-      </w:r>
+        <w:t>call_id is VRS AI's provider call identifier. It must be globally unique and stable. Express stores it separately from the public Express bridge ID. Every callback from VRS AI must use this value in callId.</w:t>
+      </w:r>
+      <w:r/>
       <w:r>
         <w:rPr>
           <w:rFonts w:ascii="Consolas" w:hAnsi="Consolas"/>
           <w:color w:val="17365D"/>
           <w:sz w:val="18"/>
         </w:rPr>
-        <w:t>callId</w:t>
-      </w:r>
-      <w:r>
-        <w:t>.</w:t>
-      </w:r>
+      </w:r>
+      <w:r/>
     </w:p>
     <w:p>
       <w:pPr>
@@ -5466,7 +5294,7 @@
     </w:p>
     <w:p>
       <w:r>
-        <w:t xml:space="preserve">VRS AI must POST to the exact </w:t>
+        <w:t>VRS AI must POST to the exact callback_url received in the authorize request. Do not hardcode an upstream callback URL. Express owns the callback hop from VRS AI.</w:t>
       </w:r>
       <w:r>
         <w:rPr>
@@ -5474,11 +5302,8 @@
           <w:color w:val="17365D"/>
           <w:sz w:val="18"/>
         </w:rPr>
-        <w:t>callback_url</w:t>
-      </w:r>
-      <w:r>
-        <w:t xml:space="preserve"> received in the authorize request. Do not hardcode a SASHA callback URL. Express owns the callback hop from VRS AI.</w:t>
-      </w:r>
+      </w:r>
+      <w:r/>
     </w:p>
     <w:p>
       <w:pPr>
@@ -7041,7 +6866,7 @@
     </w:p>
     <w:p>
       <w:r>
-        <w:t xml:space="preserve">Express then forwards the event to SASHA with the public Express bridge </w:t>
+        <w:t>Express then forwards the event to the upstream workflow with the public Express bridge callId. VRS AI does not perform that forwarding hop.</w:t>
       </w:r>
       <w:r>
         <w:rPr>
@@ -7049,11 +6874,8 @@
           <w:color w:val="17365D"/>
           <w:sz w:val="18"/>
         </w:rPr>
-        <w:t>callId</w:t>
-      </w:r>
-      <w:r>
-        <w:t>. VRS AI does not perform the SASHA forwarding hop.</w:t>
-      </w:r>
+      </w:r>
+      <w:r/>
     </w:p>
     <w:p>
       <w:pPr>
@@ -8560,11 +8382,9 @@
         <w:rPr>
           <w:b/>
         </w:rPr>
-        <w:t xml:space="preserve">[ ] </w:t>
-      </w:r>
-      <w:r>
-        <w:t>Exposed credentials from the earlier SSH-output incident are rotated with authorized approval and coordination.</w:t>
-      </w:r>
+        <w:t>[ ] Staging credentials are newly provisioned, exchanged through an approved secure channel, and verified without appearing in source control or logs.</w:t>
+      </w:r>
+      <w:r/>
     </w:p>
     <w:p>
       <w:pPr>
@@ -9139,7 +8959,7 @@
         <w:keepNext/>
       </w:pPr>
       <w:r>
-        <w:t>the full AHS staging flow passes from Express human approval through the SASHA callback;</w:t>
+        <w:t>the full AHS staging flow passes from Express human approval through the final upstream callback;</w:t>
       </w:r>
     </w:p>
     <w:p>

</xml_diff>

<commit_message>
Provide signed V8 photo download URLs
</commit_message>
<xml_diff>
--- a/output/doc/VRS-Express-VRS-AI-Bridge-Integration-Handoff.docx
+++ b/output/doc/VRS-Express-VRS-AI-Bridge-Integration-Handoff.docx
@@ -4742,11 +4742,7 @@
               <w:spacing w:after="0"/>
             </w:pPr>
             <w:r>
-              <w:rPr>
-                <w:rFonts w:ascii="Calibri" w:hAnsi="Calibri"/>
-                <w:sz w:val="20"/>
-              </w:rPr>
-              <w:t>Sender-provided TINA/signed photo URLs pass through byte-for-byte and require no VRS Express login. VRS Express does not convert authenticated internal /objects/ paths into outbound sender photo URLs.</w:t>
+              <w:t>Sender-provided HTTPS photo URLs pass through unchanged. For V8 tickets with an empty appliance_photos array, VRS Express converts stored /objects/ paths into direct signed Object Storage GET URLs valid for 24 hours. VRS AI downloads each with a plain GET and no VRS Express API key, login, or media token. A signing failure stops dispatch; internal paths are never sent.</w:t>
             </w:r>
           </w:p>
         </w:tc>
@@ -7334,11 +7330,7 @@
         <w:ind w:left="540" w:hanging="271"/>
       </w:pPr>
       <w:r>
-        <w:rPr>
-          <w:rFonts w:ascii="Calibri" w:hAnsi="Calibri"/>
-          <w:sz w:val="20"/>
-        </w:rPr>
-        <w:t>[ ] Approve the V8 ticket and confirm exactly one strict V8 request arrives, with the same contract version and usable sender-signed photos.</w:t>
+        <w:t>[ ] Approve the V8 ticket and confirm exactly one strict V8 request arrives, with the same contract version and direct photo URLs that download with a plain GET and no VRS Express credentials.</w:t>
       </w:r>
     </w:p>
     <w:p>

</xml_diff>